<commit_message>
QMS Manual: set corporate org-chart bottom tier to Quality Manager
Replace the bottom role in the Quality Management Manual's corporate
organisation chart (Annex A.3) from HSSE Manager to Quality Manager, with a
QMS-specific chart image so the HSE Manual's chart is unaffected. Align the
named role-holder references accordingly (document-control reviewer/approver,
document-index Tier 1 owner, leadership narrative).

Co-Authored-By: Claude Opus 4.8 <noreply@anthropic.com>
Claude-Session: https://claude.ai/code/session_01Gkd3K8tDngLcQLDrM4dcJc
</commit_message>
<xml_diff>
--- a/New HSSE Management System 2026/00-Governance/01-DAN-MAN-QMS-000001__Jun_2026_v00_Quality_Management_Manual.docx
+++ b/New HSSE Management System 2026/00-Governance/01-DAN-MAN-QMS-000001__Jun_2026_v00_Quality_Management_Manual.docx
@@ -1130,7 +1130,7 @@
                 <w:sz w:val="18"/>
                 <w:szCs w:val="18"/>
               </w:rPr>
-              <w:t xml:space="preserve">Quality Manager (Quality, Health, Safety, Security &amp; Environment)</w:t>
+              <w:t xml:space="preserve">Quality Manager</w:t>
             </w:r>
           </w:p>
         </w:tc>
@@ -1219,7 +1219,7 @@
                 <w:sz w:val="18"/>
                 <w:szCs w:val="18"/>
               </w:rPr>
-              <w:t xml:space="preserve">HSSE Manager</w:t>
+              <w:t xml:space="preserve">Delivery Director</w:t>
             </w:r>
           </w:p>
         </w:tc>
@@ -1308,7 +1308,7 @@
                 <w:sz w:val="18"/>
                 <w:szCs w:val="18"/>
               </w:rPr>
-              <w:t xml:space="preserve">Delivery Director</w:t>
+              <w:t xml:space="preserve">CDO (Chief Development Officer)</w:t>
             </w:r>
           </w:p>
         </w:tc>
@@ -5082,7 +5082,7 @@
           <w:sz w:val="20"/>
           <w:szCs w:val="20"/>
         </w:rPr>
-        <w:t xml:space="preserve">DAN's leadership — the Chief Executive Officer (CEO), the Chief Development Officer (CDO) and the Delivery Director, supported by the HSSE/Quality function — demonstrates full commitment to establishing, implementing and continually improving the QMS, ensuring it achieves its intended results and drives Client satisfaction, compliance and organisational excellence. Key leadership responsibilities include:</w:t>
+        <w:t xml:space="preserve">DAN's leadership — the Chief Executive Officer (CEO), the Chief Development Officer (CDO) and the Delivery Director, supported by the Quality function — demonstrates full commitment to establishing, implementing and continually improving the QMS, ensuring it achieves its intended results and drives Client satisfaction, compliance and organisational excellence. Key leadership responsibilities include:</w:t>
       </w:r>
     </w:p>
     <w:p>
@@ -10399,7 +10399,7 @@
           <w:sz w:val="20"/>
           <w:szCs w:val="20"/>
         </w:rPr>
-        <w:t xml:space="preserve">DAN's corporate quality governance runs from the CEO through the CDO and the Delivery Director to the HSSE/Quality Manager who leads the QHSSE function. On each project, DAN (as Employer/Client) directs delivery through the PMC, which manages and supervises the Contractor:</w:t>
+        <w:t xml:space="preserve">DAN's corporate quality governance runs from the CEO through the CDO and the Delivery Director to the Quality Manager who leads the quality function. On each project, DAN (as Employer/Client) directs delivery through the PMC, which manages and supervises the Contractor:</w:t>
       </w:r>
     </w:p>
     <w:p>
@@ -10413,7 +10413,7 @@
           <wp:inline distT="0" distB="0" distL="0" distR="0">
             <wp:extent cx="4095750" cy="3924300"/>
             <wp:effectExtent t="0" r="0" b="0" l="0"/>
-            <wp:docPr id="1" name="Figure A.3.1  DAN Corporate Organisation (QHSSE governance)" descr="Figure A.3.1  DAN Corporate Organisation (QHSSE governance)" title="Figure A.3.1  DAN Corporate Organisation (QHSSE governance)"/>
+            <wp:docPr id="1" name="Figure A.3.1  DAN Corporate Organisation (quality governance)" descr="Figure A.3.1  DAN Corporate Organisation (quality governance)" title="Figure A.3.1  DAN Corporate Organisation (quality governance)"/>
             <wp:cNvGraphicFramePr>
               <a:graphicFrameLocks xmlns:a="http://schemas.openxmlformats.org/drawingml/2006/main" noChangeAspect="1"/>
             </wp:cNvGraphicFramePr>
@@ -10463,7 +10463,7 @@
           <w:sz w:val="16"/>
           <w:szCs w:val="16"/>
         </w:rPr>
-        <w:t xml:space="preserve">Figure A.3.1  DAN Corporate Organisation (QHSSE governance)</w:t>
+        <w:t xml:space="preserve">Figure A.3.1  DAN Corporate Organisation (quality governance)</w:t>
       </w:r>
     </w:p>
     <w:p>
@@ -11308,7 +11308,7 @@
                 <w:sz w:val="18"/>
                 <w:szCs w:val="18"/>
               </w:rPr>
-              <w:t xml:space="preserve">Quality Policy, QMS Manual, QHSSE strategy</w:t>
+              <w:t xml:space="preserve">Quality Policy, QMS Manual, quality strategy</w:t>
             </w:r>
           </w:p>
         </w:tc>
@@ -11366,7 +11366,7 @@
                 <w:sz w:val="18"/>
                 <w:szCs w:val="18"/>
               </w:rPr>
-              <w:t xml:space="preserve">HSSE / Quality Manager</w:t>
+              <w:t xml:space="preserve">Quality Manager</w:t>
             </w:r>
           </w:p>
         </w:tc>

</xml_diff>

<commit_message>
Rectify PIF/CoE quality-review comments on the Quality Manual and QMP
Address the PIF Centre of Excellence review findings on the quality documents:

- Replace the generic HSE approval roles on the cover with named Quality
  personnel: Prepared by Quality Manager (Quality Department), Reviewed by
  Amjed Sammari (Delivery Director), Approved by AbdulHalim Kaissy (CDO).
- Set the Document Owner to the Quality Department (was HSE Department).
- Quality Manual: name the personnel in the body review-and-approval table and
  note it is a Quality Function document.
- QMP: add a PMC / CSC Quality Requirements section (CoE finding SN 5b).
- Enable table-of-contents field updating so page numbers populate on open
  (CoE finding SN 2 — TOC page numbering).

Co-Authored-By: Claude Opus 4.8 <noreply@anthropic.com>
Claude-Session: https://claude.ai/code/session_01Gkd3K8tDngLcQLDrM4dcJc
</commit_message>
<xml_diff>
--- a/New HSSE Management System 2026/00-Governance/01-DAN-MAN-QMS-000001__Jun_2026_v00_Quality_Management_Manual.docx
+++ b/New HSSE Management System 2026/00-Governance/01-DAN-MAN-QMS-000001__Jun_2026_v00_Quality_Management_Manual.docx
@@ -567,7 +567,7 @@
                 <w:sz w:val="18"/>
                 <w:szCs w:val="18"/>
               </w:rPr>
-              <w:t xml:space="preserve">HSE Department</w:t>
+              <w:t xml:space="preserve">Quality Department</w:t>
             </w:r>
           </w:p>
         </w:tc>
@@ -776,24 +776,26 @@
               <w:right w:val="single" w:color="BFB3AA" w:sz="4"/>
             </w:tcBorders>
             <w:tcMar>
-              <w:top w:type="dxa" w:w="200"/>
-              <w:left w:type="dxa" w:w="120"/>
-              <w:bottom w:type="dxa" w:w="200"/>
+              <w:top w:type="dxa" w:w="160"/>
+              <w:left w:type="dxa" w:w="120"/>
+              <w:bottom w:type="dxa" w:w="160"/>
               <w:right w:type="dxa" w:w="120"/>
             </w:tcMar>
           </w:tcPr>
           <w:p>
             <w:pPr>
-              <w:spacing w:after="240"/>
+              <w:spacing w:after="220"/>
             </w:pPr>
             <w:r>
               <w:rPr>
                 <w:rFonts w:ascii="Tahoma" w:cs="Tahoma" w:eastAsia="Tahoma" w:hAnsi="Tahoma"/>
-                <w:color w:val="595959"/>
-                <w:sz w:val="16"/>
-                <w:szCs w:val="16"/>
-              </w:rPr>
-              <w:t xml:space="preserve">HSE Representative</w:t>
+                <w:b/>
+                <w:bCs/>
+                <w:color w:val="222222"/>
+                <w:sz w:val="18"/>
+                <w:szCs w:val="18"/>
+              </w:rPr>
+              <w:t xml:space="preserve">Quality Manager</w:t>
             </w:r>
           </w:p>
           <w:p>
@@ -818,24 +820,40 @@
               <w:right w:val="single" w:color="BFB3AA" w:sz="4"/>
             </w:tcBorders>
             <w:tcMar>
-              <w:top w:type="dxa" w:w="200"/>
-              <w:left w:type="dxa" w:w="120"/>
-              <w:bottom w:type="dxa" w:w="200"/>
+              <w:top w:type="dxa" w:w="160"/>
+              <w:left w:type="dxa" w:w="120"/>
+              <w:bottom w:type="dxa" w:w="160"/>
               <w:right w:type="dxa" w:w="120"/>
             </w:tcMar>
           </w:tcPr>
           <w:p>
             <w:pPr>
-              <w:spacing w:after="240"/>
+              <w:spacing w:after="20"/>
             </w:pPr>
             <w:r>
               <w:rPr>
                 <w:rFonts w:ascii="Tahoma" w:cs="Tahoma" w:eastAsia="Tahoma" w:hAnsi="Tahoma"/>
+                <w:b/>
+                <w:bCs/>
+                <w:color w:val="222222"/>
+                <w:sz w:val="18"/>
+                <w:szCs w:val="18"/>
+              </w:rPr>
+              <w:t xml:space="preserve">Amjed Sammari</w:t>
+            </w:r>
+          </w:p>
+          <w:p>
+            <w:pPr>
+              <w:spacing w:after="200"/>
+            </w:pPr>
+            <w:r>
+              <w:rPr>
+                <w:rFonts w:ascii="Tahoma" w:cs="Tahoma" w:eastAsia="Tahoma" w:hAnsi="Tahoma"/>
                 <w:color w:val="595959"/>
-                <w:sz w:val="16"/>
-                <w:szCs w:val="16"/>
-              </w:rPr>
-              <w:t xml:space="preserve">Competent Person (HSE)</w:t>
+                <w:sz w:val="14"/>
+                <w:szCs w:val="14"/>
+              </w:rPr>
+              <w:t xml:space="preserve">Delivery Director</w:t>
             </w:r>
           </w:p>
           <w:p>
@@ -860,24 +878,40 @@
               <w:right w:val="single" w:color="BFB3AA" w:sz="4"/>
             </w:tcBorders>
             <w:tcMar>
-              <w:top w:type="dxa" w:w="200"/>
-              <w:left w:type="dxa" w:w="120"/>
-              <w:bottom w:type="dxa" w:w="200"/>
+              <w:top w:type="dxa" w:w="160"/>
+              <w:left w:type="dxa" w:w="120"/>
+              <w:bottom w:type="dxa" w:w="160"/>
               <w:right w:type="dxa" w:w="120"/>
             </w:tcMar>
           </w:tcPr>
           <w:p>
             <w:pPr>
-              <w:spacing w:after="240"/>
+              <w:spacing w:after="20"/>
             </w:pPr>
             <w:r>
               <w:rPr>
                 <w:rFonts w:ascii="Tahoma" w:cs="Tahoma" w:eastAsia="Tahoma" w:hAnsi="Tahoma"/>
+                <w:b/>
+                <w:bCs/>
+                <w:color w:val="222222"/>
+                <w:sz w:val="18"/>
+                <w:szCs w:val="18"/>
+              </w:rPr>
+              <w:t xml:space="preserve">AbdulHalim Kaissy</w:t>
+            </w:r>
+          </w:p>
+          <w:p>
+            <w:pPr>
+              <w:spacing w:after="200"/>
+            </w:pPr>
+            <w:r>
+              <w:rPr>
+                <w:rFonts w:ascii="Tahoma" w:cs="Tahoma" w:eastAsia="Tahoma" w:hAnsi="Tahoma"/>
                 <w:color w:val="595959"/>
-                <w:sz w:val="16"/>
-                <w:szCs w:val="16"/>
-              </w:rPr>
-              <w:t xml:space="preserve">Project Director / Manager</w:t>
+                <w:sz w:val="14"/>
+                <w:szCs w:val="14"/>
+              </w:rPr>
+              <w:t xml:space="preserve">Chief Development Officer (CDO)</w:t>
             </w:r>
           </w:p>
           <w:p>
@@ -957,6 +991,20 @@
         <w:t xml:space="preserve">Document Control — Review and Approval</w:t>
       </w:r>
     </w:p>
+    <w:p>
+      <w:pPr>
+        <w:spacing w:after="120" w:line="276"/>
+        <w:jc w:val="both"/>
+      </w:pPr>
+      <w:r>
+        <w:rPr>
+          <w:rFonts w:ascii="Tahoma" w:cs="Tahoma" w:eastAsia="Tahoma" w:hAnsi="Tahoma"/>
+          <w:sz w:val="20"/>
+          <w:szCs w:val="20"/>
+        </w:rPr>
+        <w:t xml:space="preserve">This Quality Manual is a Quality Function document, prepared, reviewed and approved by the relevant quality personnel.</w:t>
+      </w:r>
+    </w:p>
     <w:tbl>
       <w:tblPr>
         <w:tblW w:type="dxa" w:w="9360"/>
@@ -970,9 +1018,10 @@
         </w:tblBorders>
       </w:tblPr>
       <w:tblGrid>
-        <w:gridCol w:w="3120"/>
-        <w:gridCol w:w="3120"/>
-        <w:gridCol w:w="3120"/>
+        <w:gridCol w:w="2000"/>
+        <w:gridCol w:w="2600"/>
+        <w:gridCol w:w="2760"/>
+        <w:gridCol w:w="2000"/>
       </w:tblGrid>
       <w:tr>
         <w:trPr>
@@ -980,7 +1029,7 @@
         </w:trPr>
         <w:tc>
           <w:tcPr>
-            <w:tcW w:type="dxa" w:w="3120"/>
+            <w:tcW w:type="dxa" w:w="2000"/>
             <w:tcBorders>
               <w:top w:val="single" w:color="BFB3AA" w:sz="4"/>
               <w:left w:val="single" w:color="BFB3AA" w:sz="4"/>
@@ -1012,7 +1061,7 @@
         </w:tc>
         <w:tc>
           <w:tcPr>
-            <w:tcW w:type="dxa" w:w="3120"/>
+            <w:tcW w:type="dxa" w:w="2600"/>
             <w:tcBorders>
               <w:top w:val="single" w:color="BFB3AA" w:sz="4"/>
               <w:left w:val="single" w:color="BFB3AA" w:sz="4"/>
@@ -1038,13 +1087,13 @@
                 <w:sz w:val="18"/>
                 <w:szCs w:val="18"/>
               </w:rPr>
-              <w:t xml:space="preserve">Role</w:t>
-            </w:r>
-          </w:p>
-        </w:tc>
-        <w:tc>
-          <w:tcPr>
-            <w:tcW w:type="dxa" w:w="3120"/>
+              <w:t xml:space="preserve">Name</w:t>
+            </w:r>
+          </w:p>
+        </w:tc>
+        <w:tc>
+          <w:tcPr>
+            <w:tcW w:type="dxa" w:w="2760"/>
             <w:tcBorders>
               <w:top w:val="single" w:color="BFB3AA" w:sz="4"/>
               <w:left w:val="single" w:color="BFB3AA" w:sz="4"/>
@@ -1070,6 +1119,38 @@
                 <w:sz w:val="18"/>
                 <w:szCs w:val="18"/>
               </w:rPr>
+              <w:t xml:space="preserve">Role</w:t>
+            </w:r>
+          </w:p>
+        </w:tc>
+        <w:tc>
+          <w:tcPr>
+            <w:tcW w:type="dxa" w:w="2000"/>
+            <w:tcBorders>
+              <w:top w:val="single" w:color="BFB3AA" w:sz="4"/>
+              <w:left w:val="single" w:color="BFB3AA" w:sz="4"/>
+              <w:bottom w:val="single" w:color="BFB3AA" w:sz="4"/>
+              <w:right w:val="single" w:color="BFB3AA" w:sz="4"/>
+            </w:tcBorders>
+            <w:shd w:fill="542A12" w:color="auto" w:val="clear"/>
+            <w:tcMar>
+              <w:top w:type="dxa" w:w="60"/>
+              <w:left w:type="dxa" w:w="120"/>
+              <w:bottom w:type="dxa" w:w="60"/>
+              <w:right w:type="dxa" w:w="120"/>
+            </w:tcMar>
+            <w:vAlign w:val="center"/>
+          </w:tcPr>
+          <w:p>
+            <w:r>
+              <w:rPr>
+                <w:rFonts w:ascii="Tahoma" w:cs="Tahoma" w:eastAsia="Tahoma" w:hAnsi="Tahoma"/>
+                <w:b/>
+                <w:bCs/>
+                <w:color w:val="FFFFFF"/>
+                <w:sz w:val="18"/>
+                <w:szCs w:val="18"/>
+              </w:rPr>
               <w:t xml:space="preserve">Date</w:t>
             </w:r>
           </w:p>
@@ -1078,7 +1159,7 @@
       <w:tr>
         <w:tc>
           <w:tcPr>
-            <w:tcW w:type="dxa" w:w="3120"/>
+            <w:tcW w:type="dxa" w:w="2000"/>
             <w:tcBorders>
               <w:top w:val="single" w:color="BFB3AA" w:sz="4"/>
               <w:left w:val="single" w:color="BFB3AA" w:sz="4"/>
@@ -1107,7 +1188,7 @@
         </w:tc>
         <w:tc>
           <w:tcPr>
-            <w:tcW w:type="dxa" w:w="3120"/>
+            <w:tcW w:type="dxa" w:w="2600"/>
             <w:tcBorders>
               <w:top w:val="single" w:color="BFB3AA" w:sz="4"/>
               <w:left w:val="single" w:color="BFB3AA" w:sz="4"/>
@@ -1136,7 +1217,36 @@
         </w:tc>
         <w:tc>
           <w:tcPr>
-            <w:tcW w:type="dxa" w:w="3120"/>
+            <w:tcW w:type="dxa" w:w="2760"/>
+            <w:tcBorders>
+              <w:top w:val="single" w:color="BFB3AA" w:sz="4"/>
+              <w:left w:val="single" w:color="BFB3AA" w:sz="4"/>
+              <w:bottom w:val="single" w:color="BFB3AA" w:sz="4"/>
+              <w:right w:val="single" w:color="BFB3AA" w:sz="4"/>
+            </w:tcBorders>
+            <w:tcMar>
+              <w:top w:type="dxa" w:w="60"/>
+              <w:left w:type="dxa" w:w="120"/>
+              <w:bottom w:type="dxa" w:w="60"/>
+              <w:right w:type="dxa" w:w="120"/>
+            </w:tcMar>
+            <w:vAlign w:val="center"/>
+          </w:tcPr>
+          <w:p>
+            <w:r>
+              <w:rPr>
+                <w:rFonts w:ascii="Tahoma" w:cs="Tahoma" w:eastAsia="Tahoma" w:hAnsi="Tahoma"/>
+                <w:color w:val="222222"/>
+                <w:sz w:val="18"/>
+                <w:szCs w:val="18"/>
+              </w:rPr>
+              <w:t xml:space="preserve">Quality Department</w:t>
+            </w:r>
+          </w:p>
+        </w:tc>
+        <w:tc>
+          <w:tcPr>
+            <w:tcW w:type="dxa" w:w="2000"/>
             <w:tcBorders>
               <w:top w:val="single" w:color="BFB3AA" w:sz="4"/>
               <w:left w:val="single" w:color="BFB3AA" w:sz="4"/>
@@ -1167,7 +1277,7 @@
       <w:tr>
         <w:tc>
           <w:tcPr>
-            <w:tcW w:type="dxa" w:w="3120"/>
+            <w:tcW w:type="dxa" w:w="2000"/>
             <w:tcBorders>
               <w:top w:val="single" w:color="BFB3AA" w:sz="4"/>
               <w:left w:val="single" w:color="BFB3AA" w:sz="4"/>
@@ -1196,7 +1306,36 @@
         </w:tc>
         <w:tc>
           <w:tcPr>
-            <w:tcW w:type="dxa" w:w="3120"/>
+            <w:tcW w:type="dxa" w:w="2600"/>
+            <w:tcBorders>
+              <w:top w:val="single" w:color="BFB3AA" w:sz="4"/>
+              <w:left w:val="single" w:color="BFB3AA" w:sz="4"/>
+              <w:bottom w:val="single" w:color="BFB3AA" w:sz="4"/>
+              <w:right w:val="single" w:color="BFB3AA" w:sz="4"/>
+            </w:tcBorders>
+            <w:tcMar>
+              <w:top w:type="dxa" w:w="60"/>
+              <w:left w:type="dxa" w:w="120"/>
+              <w:bottom w:type="dxa" w:w="60"/>
+              <w:right w:type="dxa" w:w="120"/>
+            </w:tcMar>
+            <w:vAlign w:val="center"/>
+          </w:tcPr>
+          <w:p>
+            <w:r>
+              <w:rPr>
+                <w:rFonts w:ascii="Tahoma" w:cs="Tahoma" w:eastAsia="Tahoma" w:hAnsi="Tahoma"/>
+                <w:color w:val="222222"/>
+                <w:sz w:val="18"/>
+                <w:szCs w:val="18"/>
+              </w:rPr>
+              <w:t xml:space="preserve">Amjed Sammari</w:t>
+            </w:r>
+          </w:p>
+        </w:tc>
+        <w:tc>
+          <w:tcPr>
+            <w:tcW w:type="dxa" w:w="2760"/>
             <w:tcBorders>
               <w:top w:val="single" w:color="BFB3AA" w:sz="4"/>
               <w:left w:val="single" w:color="BFB3AA" w:sz="4"/>
@@ -1225,7 +1364,7 @@
         </w:tc>
         <w:tc>
           <w:tcPr>
-            <w:tcW w:type="dxa" w:w="3120"/>
+            <w:tcW w:type="dxa" w:w="2000"/>
             <w:tcBorders>
               <w:top w:val="single" w:color="BFB3AA" w:sz="4"/>
               <w:left w:val="single" w:color="BFB3AA" w:sz="4"/>
@@ -1256,7 +1395,7 @@
       <w:tr>
         <w:tc>
           <w:tcPr>
-            <w:tcW w:type="dxa" w:w="3120"/>
+            <w:tcW w:type="dxa" w:w="2000"/>
             <w:tcBorders>
               <w:top w:val="single" w:color="BFB3AA" w:sz="4"/>
               <w:left w:val="single" w:color="BFB3AA" w:sz="4"/>
@@ -1285,36 +1424,65 @@
         </w:tc>
         <w:tc>
           <w:tcPr>
-            <w:tcW w:type="dxa" w:w="3120"/>
-            <w:tcBorders>
-              <w:top w:val="single" w:color="BFB3AA" w:sz="4"/>
-              <w:left w:val="single" w:color="BFB3AA" w:sz="4"/>
-              <w:bottom w:val="single" w:color="BFB3AA" w:sz="4"/>
-              <w:right w:val="single" w:color="BFB3AA" w:sz="4"/>
-            </w:tcBorders>
-            <w:tcMar>
-              <w:top w:type="dxa" w:w="60"/>
-              <w:left w:type="dxa" w:w="120"/>
-              <w:bottom w:type="dxa" w:w="60"/>
-              <w:right w:type="dxa" w:w="120"/>
-            </w:tcMar>
-            <w:vAlign w:val="center"/>
-          </w:tcPr>
-          <w:p>
-            <w:r>
-              <w:rPr>
-                <w:rFonts w:ascii="Tahoma" w:cs="Tahoma" w:eastAsia="Tahoma" w:hAnsi="Tahoma"/>
-                <w:color w:val="222222"/>
-                <w:sz w:val="18"/>
-                <w:szCs w:val="18"/>
-              </w:rPr>
-              <w:t xml:space="preserve">CDO (Chief Development Officer)</w:t>
-            </w:r>
-          </w:p>
-        </w:tc>
-        <w:tc>
-          <w:tcPr>
-            <w:tcW w:type="dxa" w:w="3120"/>
+            <w:tcW w:type="dxa" w:w="2600"/>
+            <w:tcBorders>
+              <w:top w:val="single" w:color="BFB3AA" w:sz="4"/>
+              <w:left w:val="single" w:color="BFB3AA" w:sz="4"/>
+              <w:bottom w:val="single" w:color="BFB3AA" w:sz="4"/>
+              <w:right w:val="single" w:color="BFB3AA" w:sz="4"/>
+            </w:tcBorders>
+            <w:tcMar>
+              <w:top w:type="dxa" w:w="60"/>
+              <w:left w:type="dxa" w:w="120"/>
+              <w:bottom w:type="dxa" w:w="60"/>
+              <w:right w:type="dxa" w:w="120"/>
+            </w:tcMar>
+            <w:vAlign w:val="center"/>
+          </w:tcPr>
+          <w:p>
+            <w:r>
+              <w:rPr>
+                <w:rFonts w:ascii="Tahoma" w:cs="Tahoma" w:eastAsia="Tahoma" w:hAnsi="Tahoma"/>
+                <w:color w:val="222222"/>
+                <w:sz w:val="18"/>
+                <w:szCs w:val="18"/>
+              </w:rPr>
+              <w:t xml:space="preserve">AbdulHalim Kaissy</w:t>
+            </w:r>
+          </w:p>
+        </w:tc>
+        <w:tc>
+          <w:tcPr>
+            <w:tcW w:type="dxa" w:w="2760"/>
+            <w:tcBorders>
+              <w:top w:val="single" w:color="BFB3AA" w:sz="4"/>
+              <w:left w:val="single" w:color="BFB3AA" w:sz="4"/>
+              <w:bottom w:val="single" w:color="BFB3AA" w:sz="4"/>
+              <w:right w:val="single" w:color="BFB3AA" w:sz="4"/>
+            </w:tcBorders>
+            <w:tcMar>
+              <w:top w:type="dxa" w:w="60"/>
+              <w:left w:type="dxa" w:w="120"/>
+              <w:bottom w:type="dxa" w:w="60"/>
+              <w:right w:type="dxa" w:w="120"/>
+            </w:tcMar>
+            <w:vAlign w:val="center"/>
+          </w:tcPr>
+          <w:p>
+            <w:r>
+              <w:rPr>
+                <w:rFonts w:ascii="Tahoma" w:cs="Tahoma" w:eastAsia="Tahoma" w:hAnsi="Tahoma"/>
+                <w:color w:val="222222"/>
+                <w:sz w:val="18"/>
+                <w:szCs w:val="18"/>
+              </w:rPr>
+              <w:t xml:space="preserve">Chief Development Officer (CDO)</w:t>
+            </w:r>
+          </w:p>
+        </w:tc>
+        <w:tc>
+          <w:tcPr>
+            <w:tcW w:type="dxa" w:w="2000"/>
             <w:tcBorders>
               <w:top w:val="single" w:color="BFB3AA" w:sz="4"/>
               <w:left w:val="single" w:color="BFB3AA" w:sz="4"/>
@@ -6132,7 +6300,7 @@
                 <w:sz w:val="18"/>
                 <w:szCs w:val="18"/>
               </w:rPr>
-              <w:t xml:space="preserve">HSSE / Quality Manager</w:t>
+              <w:t xml:space="preserve">Quality Manager</w:t>
             </w:r>
           </w:p>
         </w:tc>
@@ -6161,7 +6329,7 @@
                 <w:sz w:val="18"/>
                 <w:szCs w:val="18"/>
               </w:rPr>
-              <w:t xml:space="preserve">Lead QMS governance; approve manuals, procedures and audit plans; maintain QMS documents; monitor KPIs and report to leadership.</w:t>
+              <w:t xml:space="preserve">Lead QMS governance; prepare and maintain the quality manual, procedures and audit plans; maintain QMS documents; monitor KPIs and report to leadership.</w:t>
             </w:r>
           </w:p>
         </w:tc>

</xml_diff>